<commit_message>
Rulings 27, 27a, 18, 19, 28: assessment is one paper numbered straight through with two flagged transfer items and the follow-through line; A7 takes no review day per Croix and keeps the reteach day; exams land Mon/Thu with spiral days for slack; every IXL skill required at SmartScore 67, runs merged into one assignment
Co-Authored-By: Claude Opus 5 <noreply@anthropic.com>
</commit_message>
<xml_diff>
--- a/a7/build/out/u3/A7 3  Unit Assessment Key.docx
+++ b/a7/build/out/u3/A7 3  Unit Assessment Key.docx
@@ -70,7 +70,7 @@
                 <w:color w:val="6B6B6B"/>
                 <w:sz w:val="19"/>
               </w:rPr>
-              <w:t>39 points  ·  two class periods</w:t>
+              <w:t>41 points  ·  two periods; students continue the same paper</w:t>
             </w:r>
             <w:r>
               <w:rPr>
@@ -196,22 +196,21 @@
     </w:p>
     <w:p>
       <w:pPr>
-        <w:keepNext/>
-        <w:spacing w:before="40" w:after="40"/>
+        <w:spacing w:before="0" w:after="60"/>
       </w:pPr>
       <w:r>
         <w:rPr>
           <w:b/>
           <w:i w:val="0"/>
           <w:color w:val="1A1A1A"/>
-          <w:sz w:val="24"/>
+          <w:sz w:val="20"/>
         </w:rPr>
-        <w:t>Day 1</w:t>
+        <w:t>This assessment runs over two class periods. Stop when the period ends; you will continue from where you stopped.</w:t>
       </w:r>
     </w:p>
     <w:p>
       <w:pPr>
-        <w:spacing w:before="0" w:after="80"/>
+        <w:spacing w:before="0" w:after="160"/>
       </w:pPr>
       <w:r>
         <w:rPr>
@@ -220,7 +219,7 @@
           <w:color w:val="6B6B6B"/>
           <w:sz w:val="19"/>
         </w:rPr>
-        <w:t>Sections 1 and 2 — numerical bases   ·   19 points</w:t>
+        <w:t>If an earlier part is wrong, a later part still earns its point when the right operation is applied to your own earlier answer — but only if that work is on the page.</w:t>
       </w:r>
     </w:p>
     <w:p>
@@ -1892,7 +1891,7 @@
           <w:color w:val="6B6B6B"/>
           <w:sz w:val="19"/>
         </w:rPr>
-        <w:t>10 points</w:t>
+        <w:t>11 points</w:t>
       </w:r>
     </w:p>
     <w:tbl>
@@ -4021,38 +4020,518 @@
         </w:rPr>
       </w:r>
     </w:p>
-    <w:p>
-      <w:r>
-        <w:br w:type="page"/>
-      </w:r>
-    </w:p>
+    <w:tbl>
+      <w:tblPr>
+        <w:tblLayout w:type="fixed"/>
+        <w:tblLook w:firstColumn="1" w:firstRow="1" w:lastColumn="0" w:lastRow="0" w:noHBand="0" w:noVBand="1" w:val="04A0"/>
+        <w:tblLayout w:type="fixed"/>
+        <w:tblW w:w="9360" w:type="dxa"/>
+      </w:tblPr>
+      <w:tblGrid>
+        <w:gridCol w:w="9360"/>
+      </w:tblGrid>
+      <w:tr>
+        <w:trPr>
+          <w:cantSplit/>
+        </w:trPr>
+        <w:tc>
+          <w:tcPr>
+            <w:tcW w:type="dxa" w:w="9360"/>
+            <w:tcBorders>
+              <w:top w:val="nil"/>
+              <w:left w:val="nil"/>
+              <w:bottom w:val="nil"/>
+              <w:right w:val="nil"/>
+            </w:tcBorders>
+            <w:tcMar>
+              <w:top w:w="0" w:type="dxa"/>
+              <w:left w:w="0" w:type="dxa"/>
+              <w:bottom w:w="0" w:type="dxa"/>
+              <w:right w:w="0" w:type="dxa"/>
+            </w:tcMar>
+          </w:tcPr>
+          <w:p>
+            <w:pPr>
+              <w:spacing w:before="200" w:after="120"/>
+              <w:ind w:left="420" w:hanging="420"/>
+              <w:tabs>
+                <w:tab w:val="right" w:pos="9360"/>
+              </w:tabs>
+            </w:pPr>
+            <w:r>
+              <w:rPr>
+                <w:b/>
+                <w:i w:val="0"/>
+                <w:color w:val="1A1A1A"/>
+                <w:sz w:val="22"/>
+              </w:rPr>
+              <w:t xml:space="preserve">10.   </w:t>
+            </w:r>
+            <w:r>
+              <w:rPr>
+                <w:b w:val="0"/>
+                <w:i w:val="0"/>
+                <w:color w:val="1A1A1A"/>
+                <w:sz w:val="22"/>
+              </w:rPr>
+              <w:t xml:space="preserve">Which is greater,  </w:t>
+            </w:r>
+            <w:r>
+              <w:drawing>
+                <wp:inline xmlns:a="http://schemas.openxmlformats.org/drawingml/2006/main" xmlns:pic="http://schemas.openxmlformats.org/drawingml/2006/picture">
+                  <wp:extent cx="210312" cy="140208"/>
+                  <wp:docPr id="46" name="Picture 46"/>
+                  <wp:cNvGraphicFramePr>
+                    <a:graphicFrameLocks noChangeAspect="1"/>
+                  </wp:cNvGraphicFramePr>
+                  <a:graphic>
+                    <a:graphicData uri="http://schemas.openxmlformats.org/drawingml/2006/picture">
+                      <pic:pic>
+                        <pic:nvPicPr>
+                          <pic:cNvPr id="0" name="c3f1b23ff93e0772.png"/>
+                          <pic:cNvPicPr/>
+                        </pic:nvPicPr>
+                        <pic:blipFill>
+                          <a:blip r:embed="rId54"/>
+                          <a:stretch>
+                            <a:fillRect/>
+                          </a:stretch>
+                        </pic:blipFill>
+                        <pic:spPr>
+                          <a:xfrm>
+                            <a:off x="0" y="0"/>
+                            <a:ext cx="210312" cy="140208"/>
+                          </a:xfrm>
+                          <a:prstGeom prst="rect"/>
+                        </pic:spPr>
+                      </pic:pic>
+                    </a:graphicData>
+                  </a:graphic>
+                </wp:inline>
+              </w:drawing>
+            </w:r>
+            <w:r>
+              <w:rPr>
+                <w:b w:val="0"/>
+                <w:i w:val="0"/>
+                <w:color w:val="1A1A1A"/>
+                <w:sz w:val="22"/>
+              </w:rPr>
+              <w:t xml:space="preserve">  or  </w:t>
+            </w:r>
+            <w:r>
+              <w:drawing>
+                <wp:inline xmlns:a="http://schemas.openxmlformats.org/drawingml/2006/main" xmlns:pic="http://schemas.openxmlformats.org/drawingml/2006/picture">
+                  <wp:extent cx="210312" cy="143256"/>
+                  <wp:docPr id="47" name="Picture 47"/>
+                  <wp:cNvGraphicFramePr>
+                    <a:graphicFrameLocks noChangeAspect="1"/>
+                  </wp:cNvGraphicFramePr>
+                  <a:graphic>
+                    <a:graphicData uri="http://schemas.openxmlformats.org/drawingml/2006/picture">
+                      <pic:pic>
+                        <pic:nvPicPr>
+                          <pic:cNvPr id="0" name="caa3c22aa57edce6.png"/>
+                          <pic:cNvPicPr/>
+                        </pic:nvPicPr>
+                        <pic:blipFill>
+                          <a:blip r:embed="rId51"/>
+                          <a:stretch>
+                            <a:fillRect/>
+                          </a:stretch>
+                        </pic:blipFill>
+                        <pic:spPr>
+                          <a:xfrm>
+                            <a:off x="0" y="0"/>
+                            <a:ext cx="210312" cy="143256"/>
+                          </a:xfrm>
+                          <a:prstGeom prst="rect"/>
+                        </pic:spPr>
+                      </pic:pic>
+                    </a:graphicData>
+                  </a:graphic>
+                </wp:inline>
+              </w:drawing>
+            </w:r>
+            <w:r>
+              <w:rPr>
+                <w:b w:val="0"/>
+                <w:i w:val="0"/>
+                <w:color w:val="1A1A1A"/>
+                <w:sz w:val="22"/>
+              </w:rPr>
+              <w:t xml:space="preserve"> ?  Show how you know.</w:t>
+            </w:r>
+            <w:r>
+              <w:tab/>
+            </w:r>
+            <w:r>
+              <w:rPr>
+                <w:b w:val="0"/>
+                <w:i/>
+                <w:color w:val="6B6B6B"/>
+                <w:sz w:val="19"/>
+              </w:rPr>
+              <w:t>1 pt</w:t>
+            </w:r>
+          </w:p>
+          <w:p>
+            <w:pPr>
+              <w:spacing w:before="40" w:after="60"/>
+              <w:ind w:left="420"/>
+            </w:pPr>
+            <w:r>
+              <w:drawing>
+                <wp:inline xmlns:a="http://schemas.openxmlformats.org/drawingml/2006/main" xmlns:pic="http://schemas.openxmlformats.org/drawingml/2006/picture">
+                  <wp:extent cx="210312" cy="140208"/>
+                  <wp:docPr id="48" name="Picture 48"/>
+                  <wp:cNvGraphicFramePr>
+                    <a:graphicFrameLocks noChangeAspect="1"/>
+                  </wp:cNvGraphicFramePr>
+                  <a:graphic>
+                    <a:graphicData uri="http://schemas.openxmlformats.org/drawingml/2006/picture">
+                      <pic:pic>
+                        <pic:nvPicPr>
+                          <pic:cNvPr id="0" name="585ce066bd28b282.png"/>
+                          <pic:cNvPicPr/>
+                        </pic:nvPicPr>
+                        <pic:blipFill>
+                          <a:blip r:embed="rId55"/>
+                          <a:stretch>
+                            <a:fillRect/>
+                          </a:stretch>
+                        </pic:blipFill>
+                        <pic:spPr>
+                          <a:xfrm>
+                            <a:off x="0" y="0"/>
+                            <a:ext cx="210312" cy="140208"/>
+                          </a:xfrm>
+                          <a:prstGeom prst="rect"/>
+                        </pic:spPr>
+                      </pic:pic>
+                    </a:graphicData>
+                  </a:graphic>
+                </wp:inline>
+              </w:drawing>
+            </w:r>
+            <w:r>
+              <w:rPr>
+                <w:b/>
+                <w:i/>
+                <w:color w:val="9E1B32"/>
+                <w:sz w:val="22"/>
+              </w:rPr>
+              <w:t xml:space="preserve"> is greater.  </w:t>
+            </w:r>
+            <w:r>
+              <w:drawing>
+                <wp:inline xmlns:a="http://schemas.openxmlformats.org/drawingml/2006/main" xmlns:pic="http://schemas.openxmlformats.org/drawingml/2006/picture">
+                  <wp:extent cx="448056" cy="216408"/>
+                  <wp:docPr id="49" name="Picture 49"/>
+                  <wp:cNvGraphicFramePr>
+                    <a:graphicFrameLocks noChangeAspect="1"/>
+                  </wp:cNvGraphicFramePr>
+                  <a:graphic>
+                    <a:graphicData uri="http://schemas.openxmlformats.org/drawingml/2006/picture">
+                      <pic:pic>
+                        <pic:nvPicPr>
+                          <pic:cNvPr id="0" name="90800733c80c5455.png"/>
+                          <pic:cNvPicPr/>
+                        </pic:nvPicPr>
+                        <pic:blipFill>
+                          <a:blip r:embed="rId56"/>
+                          <a:stretch>
+                            <a:fillRect/>
+                          </a:stretch>
+                        </pic:blipFill>
+                        <pic:spPr>
+                          <a:xfrm>
+                            <a:off x="0" y="0"/>
+                            <a:ext cx="448056" cy="216408"/>
+                          </a:xfrm>
+                          <a:prstGeom prst="rect"/>
+                        </pic:spPr>
+                      </pic:pic>
+                    </a:graphicData>
+                  </a:graphic>
+                </wp:inline>
+              </w:drawing>
+            </w:r>
+            <w:r>
+              <w:rPr>
+                <w:b/>
+                <w:i/>
+                <w:color w:val="9E1B32"/>
+                <w:sz w:val="22"/>
+              </w:rPr>
+              <w:t xml:space="preserve"> and </w:t>
+            </w:r>
+            <w:r>
+              <w:drawing>
+                <wp:inline xmlns:a="http://schemas.openxmlformats.org/drawingml/2006/main" xmlns:pic="http://schemas.openxmlformats.org/drawingml/2006/picture">
+                  <wp:extent cx="445008" cy="216408"/>
+                  <wp:docPr id="50" name="Picture 50"/>
+                  <wp:cNvGraphicFramePr>
+                    <a:graphicFrameLocks noChangeAspect="1"/>
+                  </wp:cNvGraphicFramePr>
+                  <a:graphic>
+                    <a:graphicData uri="http://schemas.openxmlformats.org/drawingml/2006/picture">
+                      <pic:pic>
+                        <pic:nvPicPr>
+                          <pic:cNvPr id="0" name="acf7b0733d7b202c.png"/>
+                          <pic:cNvPicPr/>
+                        </pic:nvPicPr>
+                        <pic:blipFill>
+                          <a:blip r:embed="rId57"/>
+                          <a:stretch>
+                            <a:fillRect/>
+                          </a:stretch>
+                        </pic:blipFill>
+                        <pic:spPr>
+                          <a:xfrm>
+                            <a:off x="0" y="0"/>
+                            <a:ext cx="445008" cy="216408"/>
+                          </a:xfrm>
+                          <a:prstGeom prst="rect"/>
+                        </pic:spPr>
+                      </pic:pic>
+                    </a:graphicData>
+                  </a:graphic>
+                </wp:inline>
+              </w:drawing>
+            </w:r>
+            <w:r>
+              <w:rPr>
+                <w:b/>
+                <w:i/>
+                <w:color w:val="9E1B32"/>
+                <w:sz w:val="22"/>
+              </w:rPr>
+              <w:t xml:space="preserve">, and </w:t>
+            </w:r>
+            <w:r>
+              <w:drawing>
+                <wp:inline xmlns:a="http://schemas.openxmlformats.org/drawingml/2006/main" xmlns:pic="http://schemas.openxmlformats.org/drawingml/2006/picture">
+                  <wp:extent cx="301752" cy="216408"/>
+                  <wp:docPr id="51" name="Picture 51"/>
+                  <wp:cNvGraphicFramePr>
+                    <a:graphicFrameLocks noChangeAspect="1"/>
+                  </wp:cNvGraphicFramePr>
+                  <a:graphic>
+                    <a:graphicData uri="http://schemas.openxmlformats.org/drawingml/2006/picture">
+                      <pic:pic>
+                        <pic:nvPicPr>
+                          <pic:cNvPr id="0" name="bd5d876bd9344203.png"/>
+                          <pic:cNvPicPr/>
+                        </pic:nvPicPr>
+                        <pic:blipFill>
+                          <a:blip r:embed="rId58"/>
+                          <a:stretch>
+                            <a:fillRect/>
+                          </a:stretch>
+                        </pic:blipFill>
+                        <pic:spPr>
+                          <a:xfrm>
+                            <a:off x="0" y="0"/>
+                            <a:ext cx="301752" cy="216408"/>
+                          </a:xfrm>
+                          <a:prstGeom prst="rect"/>
+                        </pic:spPr>
+                      </pic:pic>
+                    </a:graphicData>
+                  </a:graphic>
+                </wp:inline>
+              </w:drawing>
+            </w:r>
+            <w:r>
+              <w:rPr>
+                <w:b/>
+                <w:i/>
+                <w:color w:val="9E1B32"/>
+                <w:sz w:val="22"/>
+              </w:rPr>
+              <w:t>.</w:t>
+            </w:r>
+          </w:p>
+          <w:p>
+            <w:pPr>
+              <w:spacing w:before="0" w:after="120"/>
+              <w:ind w:left="420"/>
+            </w:pPr>
+            <w:r>
+              <w:rPr>
+                <w:b w:val="0"/>
+                <w:i/>
+                <w:color w:val="6B6B6B"/>
+                <w:sz w:val="19"/>
+              </w:rPr>
+              <w:t xml:space="preserve">Both values must be found; a guess does not earn the point. The reciprocals put the bigger denominator on the smaller number: </w:t>
+            </w:r>
+            <w:r>
+              <w:drawing>
+                <wp:inline xmlns:a="http://schemas.openxmlformats.org/drawingml/2006/main" xmlns:pic="http://schemas.openxmlformats.org/drawingml/2006/picture">
+                  <wp:extent cx="377952" cy="146304"/>
+                  <wp:docPr id="52" name="Picture 52"/>
+                  <wp:cNvGraphicFramePr>
+                    <a:graphicFrameLocks noChangeAspect="1"/>
+                  </wp:cNvGraphicFramePr>
+                  <a:graphic>
+                    <a:graphicData uri="http://schemas.openxmlformats.org/drawingml/2006/picture">
+                      <pic:pic>
+                        <pic:nvPicPr>
+                          <pic:cNvPr id="0" name="be05a584c0c5c77e.png"/>
+                          <pic:cNvPicPr/>
+                        </pic:nvPicPr>
+                        <pic:blipFill>
+                          <a:blip r:embed="rId59"/>
+                          <a:stretch>
+                            <a:fillRect/>
+                          </a:stretch>
+                        </pic:blipFill>
+                        <pic:spPr>
+                          <a:xfrm>
+                            <a:off x="0" y="0"/>
+                            <a:ext cx="377952" cy="146304"/>
+                          </a:xfrm>
+                          <a:prstGeom prst="rect"/>
+                        </pic:spPr>
+                      </pic:pic>
+                    </a:graphicData>
+                  </a:graphic>
+                </wp:inline>
+              </w:drawing>
+            </w:r>
+            <w:r>
+              <w:rPr>
+                <w:b w:val="0"/>
+                <w:i/>
+                <w:color w:val="6B6B6B"/>
+                <w:sz w:val="19"/>
+              </w:rPr>
+              <w:t xml:space="preserve"> is bigger than </w:t>
+            </w:r>
+            <w:r>
+              <w:drawing>
+                <wp:inline xmlns:a="http://schemas.openxmlformats.org/drawingml/2006/main" xmlns:pic="http://schemas.openxmlformats.org/drawingml/2006/picture">
+                  <wp:extent cx="377952" cy="143256"/>
+                  <wp:docPr id="53" name="Picture 53"/>
+                  <wp:cNvGraphicFramePr>
+                    <a:graphicFrameLocks noChangeAspect="1"/>
+                  </wp:cNvGraphicFramePr>
+                  <a:graphic>
+                    <a:graphicData uri="http://schemas.openxmlformats.org/drawingml/2006/picture">
+                      <pic:pic>
+                        <pic:nvPicPr>
+                          <pic:cNvPr id="0" name="19f52fd500d3e7a5.png"/>
+                          <pic:cNvPicPr/>
+                        </pic:nvPicPr>
+                        <pic:blipFill>
+                          <a:blip r:embed="rId60"/>
+                          <a:stretch>
+                            <a:fillRect/>
+                          </a:stretch>
+                        </pic:blipFill>
+                        <pic:spPr>
+                          <a:xfrm>
+                            <a:off x="0" y="0"/>
+                            <a:ext cx="377952" cy="143256"/>
+                          </a:xfrm>
+                          <a:prstGeom prst="rect"/>
+                        </pic:spPr>
+                      </pic:pic>
+                    </a:graphicData>
+                  </a:graphic>
+                </wp:inline>
+              </w:drawing>
+            </w:r>
+            <w:r>
+              <w:rPr>
+                <w:b w:val="0"/>
+                <w:i/>
+                <w:color w:val="6B6B6B"/>
+                <w:sz w:val="19"/>
+              </w:rPr>
+              <w:t xml:space="preserve">, so </w:t>
+            </w:r>
+            <w:r>
+              <w:drawing>
+                <wp:inline xmlns:a="http://schemas.openxmlformats.org/drawingml/2006/main" xmlns:pic="http://schemas.openxmlformats.org/drawingml/2006/picture">
+                  <wp:extent cx="210312" cy="143256"/>
+                  <wp:docPr id="54" name="Picture 54"/>
+                  <wp:cNvGraphicFramePr>
+                    <a:graphicFrameLocks noChangeAspect="1"/>
+                  </wp:cNvGraphicFramePr>
+                  <a:graphic>
+                    <a:graphicData uri="http://schemas.openxmlformats.org/drawingml/2006/picture">
+                      <pic:pic>
+                        <pic:nvPicPr>
+                          <pic:cNvPr id="0" name="6f29b81fee25ce4b.png"/>
+                          <pic:cNvPicPr/>
+                        </pic:nvPicPr>
+                        <pic:blipFill>
+                          <a:blip r:embed="rId61"/>
+                          <a:stretch>
+                            <a:fillRect/>
+                          </a:stretch>
+                        </pic:blipFill>
+                        <pic:spPr>
+                          <a:xfrm>
+                            <a:off x="0" y="0"/>
+                            <a:ext cx="210312" cy="143256"/>
+                          </a:xfrm>
+                          <a:prstGeom prst="rect"/>
+                        </pic:spPr>
+                      </pic:pic>
+                    </a:graphicData>
+                  </a:graphic>
+                </wp:inline>
+              </w:drawing>
+            </w:r>
+            <w:r>
+              <w:rPr>
+                <w:b w:val="0"/>
+                <w:i/>
+                <w:color w:val="6B6B6B"/>
+                <w:sz w:val="19"/>
+              </w:rPr>
+              <w:t xml:space="preserve"> is the smaller of the two.  </w:t>
+            </w:r>
+            <w:r>
+              <w:rPr>
+                <w:b/>
+                <w:i/>
+                <w:color w:val="6B6B6B"/>
+                <w:sz w:val="19"/>
+              </w:rPr>
+              <w:t>TRANSFER ITEM — not on the practice test. Same benchmark, a surface nobody rehearsed.</w:t>
+            </w:r>
+          </w:p>
+          <w:p>
+            <w:pPr>
+              <w:spacing w:before="40" w:after="120"/>
+              <w:ind w:left="420"/>
+            </w:pPr>
+            <w:r>
+              <w:rPr>
+                <w:b w:val="0"/>
+                <w:i/>
+                <w:color w:val="6B6B6B"/>
+                <w:sz w:val="19"/>
+              </w:rPr>
+              <w:t>Scoring: 1 point.</w:t>
+            </w:r>
+          </w:p>
+        </w:tc>
+      </w:tr>
+    </w:tbl>
     <w:p>
       <w:pPr>
-        <w:keepNext/>
-        <w:spacing w:before="40" w:after="40"/>
+        <w:spacing w:after="0" w:before="0" w:line="20" w:lineRule="exact"/>
       </w:pPr>
       <w:r>
         <w:rPr>
-          <w:b/>
-          <w:i w:val="0"/>
-          <w:color w:val="1A1A1A"/>
-          <w:sz w:val="24"/>
+          <w:sz w:val="2"/>
         </w:rPr>
-        <w:t>Day 2</w:t>
-      </w:r>
-    </w:p>
-    <w:p>
-      <w:pPr>
-        <w:spacing w:before="0" w:after="80"/>
-      </w:pPr>
-      <w:r>
-        <w:rPr>
-          <w:b w:val="0"/>
-          <w:i/>
-          <w:color w:val="6B6B6B"/>
-          <w:sz w:val="19"/>
-        </w:rPr>
-        <w:t>Sections 3 and 4 — variable bases, and scientific notation   ·   20 points</w:t>
       </w:r>
     </w:p>
     <w:p>
@@ -4130,7 +4609,7 @@
                 <w:color w:val="1A1A1A"/>
                 <w:sz w:val="22"/>
               </w:rPr>
-              <w:t xml:space="preserve">10.   </w:t>
+              <w:t xml:space="preserve">11.   </w:t>
             </w:r>
             <w:r>
               <w:rPr>
@@ -4163,7 +4642,7 @@
               <w:drawing>
                 <wp:inline xmlns:a="http://schemas.openxmlformats.org/drawingml/2006/main" xmlns:pic="http://schemas.openxmlformats.org/drawingml/2006/picture">
                   <wp:extent cx="387096" cy="143256"/>
-                  <wp:docPr id="46" name="Picture 46"/>
+                  <wp:docPr id="55" name="Picture 55"/>
                   <wp:cNvGraphicFramePr>
                     <a:graphicFrameLocks noChangeAspect="1"/>
                   </wp:cNvGraphicFramePr>
@@ -4175,7 +4654,7 @@
                           <pic:cNvPicPr/>
                         </pic:nvPicPr>
                         <pic:blipFill>
-                          <a:blip r:embed="rId54"/>
+                          <a:blip r:embed="rId62"/>
                           <a:stretch>
                             <a:fillRect/>
                           </a:stretch>
@@ -4215,7 +4694,7 @@
               <w:drawing>
                 <wp:inline xmlns:a="http://schemas.openxmlformats.org/drawingml/2006/main" xmlns:pic="http://schemas.openxmlformats.org/drawingml/2006/picture">
                   <wp:extent cx="201168" cy="143256"/>
-                  <wp:docPr id="47" name="Picture 47"/>
+                  <wp:docPr id="56" name="Picture 56"/>
                   <wp:cNvGraphicFramePr>
                     <a:graphicFrameLocks noChangeAspect="1"/>
                   </wp:cNvGraphicFramePr>
@@ -4227,7 +4706,7 @@
                           <pic:cNvPicPr/>
                         </pic:nvPicPr>
                         <pic:blipFill>
-                          <a:blip r:embed="rId55"/>
+                          <a:blip r:embed="rId63"/>
                           <a:stretch>
                             <a:fillRect/>
                           </a:stretch>
@@ -4267,7 +4746,7 @@
               <w:drawing>
                 <wp:inline xmlns:a="http://schemas.openxmlformats.org/drawingml/2006/main" xmlns:pic="http://schemas.openxmlformats.org/drawingml/2006/picture">
                   <wp:extent cx="304800" cy="173736"/>
-                  <wp:docPr id="48" name="Picture 48"/>
+                  <wp:docPr id="57" name="Picture 57"/>
                   <wp:cNvGraphicFramePr>
                     <a:graphicFrameLocks noChangeAspect="1"/>
                   </wp:cNvGraphicFramePr>
@@ -4279,7 +4758,7 @@
                           <pic:cNvPicPr/>
                         </pic:nvPicPr>
                         <pic:blipFill>
-                          <a:blip r:embed="rId56"/>
+                          <a:blip r:embed="rId64"/>
                           <a:stretch>
                             <a:fillRect/>
                           </a:stretch>
@@ -4319,7 +4798,7 @@
               <w:drawing>
                 <wp:inline xmlns:a="http://schemas.openxmlformats.org/drawingml/2006/main" xmlns:pic="http://schemas.openxmlformats.org/drawingml/2006/picture">
                   <wp:extent cx="198120" cy="173736"/>
-                  <wp:docPr id="49" name="Picture 49"/>
+                  <wp:docPr id="58" name="Picture 58"/>
                   <wp:cNvGraphicFramePr>
                     <a:graphicFrameLocks noChangeAspect="1"/>
                   </wp:cNvGraphicFramePr>
@@ -4331,7 +4810,7 @@
                           <pic:cNvPicPr/>
                         </pic:nvPicPr>
                         <pic:blipFill>
-                          <a:blip r:embed="rId57"/>
+                          <a:blip r:embed="rId65"/>
                           <a:stretch>
                             <a:fillRect/>
                           </a:stretch>
@@ -4371,7 +4850,7 @@
               <w:drawing>
                 <wp:inline xmlns:a="http://schemas.openxmlformats.org/drawingml/2006/main" xmlns:pic="http://schemas.openxmlformats.org/drawingml/2006/picture">
                   <wp:extent cx="396240" cy="170688"/>
-                  <wp:docPr id="50" name="Picture 50"/>
+                  <wp:docPr id="59" name="Picture 59"/>
                   <wp:cNvGraphicFramePr>
                     <a:graphicFrameLocks noChangeAspect="1"/>
                   </wp:cNvGraphicFramePr>
@@ -4383,7 +4862,7 @@
                           <pic:cNvPicPr/>
                         </pic:nvPicPr>
                         <pic:blipFill>
-                          <a:blip r:embed="rId58"/>
+                          <a:blip r:embed="rId66"/>
                           <a:stretch>
                             <a:fillRect/>
                           </a:stretch>
@@ -4423,7 +4902,7 @@
               <w:drawing>
                 <wp:inline xmlns:a="http://schemas.openxmlformats.org/drawingml/2006/main" xmlns:pic="http://schemas.openxmlformats.org/drawingml/2006/picture">
                   <wp:extent cx="307848" cy="146304"/>
-                  <wp:docPr id="51" name="Picture 51"/>
+                  <wp:docPr id="60" name="Picture 60"/>
                   <wp:cNvGraphicFramePr>
                     <a:graphicFrameLocks noChangeAspect="1"/>
                   </wp:cNvGraphicFramePr>
@@ -4435,7 +4914,7 @@
                           <pic:cNvPicPr/>
                         </pic:nvPicPr>
                         <pic:blipFill>
-                          <a:blip r:embed="rId59"/>
+                          <a:blip r:embed="rId67"/>
                           <a:stretch>
                             <a:fillRect/>
                           </a:stretch>
@@ -4528,7 +5007,7 @@
               <w:drawing>
                 <wp:inline xmlns:a="http://schemas.openxmlformats.org/drawingml/2006/main" xmlns:pic="http://schemas.openxmlformats.org/drawingml/2006/picture">
                   <wp:extent cx="256032" cy="249935"/>
-                  <wp:docPr id="52" name="Picture 52"/>
+                  <wp:docPr id="61" name="Picture 61"/>
                   <wp:cNvGraphicFramePr>
                     <a:graphicFrameLocks noChangeAspect="1"/>
                   </wp:cNvGraphicFramePr>
@@ -4540,7 +5019,7 @@
                           <pic:cNvPicPr/>
                         </pic:nvPicPr>
                         <pic:blipFill>
-                          <a:blip r:embed="rId60"/>
+                          <a:blip r:embed="rId68"/>
                           <a:stretch>
                             <a:fillRect/>
                           </a:stretch>
@@ -4580,7 +5059,7 @@
               <w:drawing>
                 <wp:inline xmlns:a="http://schemas.openxmlformats.org/drawingml/2006/main" xmlns:pic="http://schemas.openxmlformats.org/drawingml/2006/picture">
                   <wp:extent cx="256032" cy="143256"/>
-                  <wp:docPr id="53" name="Picture 53"/>
+                  <wp:docPr id="62" name="Picture 62"/>
                   <wp:cNvGraphicFramePr>
                     <a:graphicFrameLocks noChangeAspect="1"/>
                   </wp:cNvGraphicFramePr>
@@ -4592,7 +5071,7 @@
                           <pic:cNvPicPr/>
                         </pic:nvPicPr>
                         <pic:blipFill>
-                          <a:blip r:embed="rId61"/>
+                          <a:blip r:embed="rId69"/>
                           <a:stretch>
                             <a:fillRect/>
                           </a:stretch>
@@ -4696,7 +5175,7 @@
                 <w:color w:val="1A1A1A"/>
                 <w:sz w:val="22"/>
               </w:rPr>
-              <w:t xml:space="preserve">11.   </w:t>
+              <w:t xml:space="preserve">12.   </w:t>
             </w:r>
             <w:r>
               <w:rPr>
@@ -4729,7 +5208,7 @@
               <w:drawing>
                 <wp:inline xmlns:a="http://schemas.openxmlformats.org/drawingml/2006/main" xmlns:pic="http://schemas.openxmlformats.org/drawingml/2006/picture">
                   <wp:extent cx="231648" cy="143256"/>
-                  <wp:docPr id="54" name="Picture 54"/>
+                  <wp:docPr id="63" name="Picture 63"/>
                   <wp:cNvGraphicFramePr>
                     <a:graphicFrameLocks noChangeAspect="1"/>
                   </wp:cNvGraphicFramePr>
@@ -4741,7 +5220,7 @@
                           <pic:cNvPicPr/>
                         </pic:nvPicPr>
                         <pic:blipFill>
-                          <a:blip r:embed="rId62"/>
+                          <a:blip r:embed="rId70"/>
                           <a:stretch>
                             <a:fillRect/>
                           </a:stretch>
@@ -4781,7 +5260,7 @@
               <w:drawing>
                 <wp:inline xmlns:a="http://schemas.openxmlformats.org/drawingml/2006/main" xmlns:pic="http://schemas.openxmlformats.org/drawingml/2006/picture">
                   <wp:extent cx="121920" cy="228600"/>
-                  <wp:docPr id="55" name="Picture 55"/>
+                  <wp:docPr id="64" name="Picture 64"/>
                   <wp:cNvGraphicFramePr>
                     <a:graphicFrameLocks noChangeAspect="1"/>
                   </wp:cNvGraphicFramePr>
@@ -4793,7 +5272,7 @@
                           <pic:cNvPicPr/>
                         </pic:nvPicPr>
                         <pic:blipFill>
-                          <a:blip r:embed="rId63"/>
+                          <a:blip r:embed="rId71"/>
                           <a:stretch>
                             <a:fillRect/>
                           </a:stretch>
@@ -4833,7 +5312,7 @@
               <w:drawing>
                 <wp:inline xmlns:a="http://schemas.openxmlformats.org/drawingml/2006/main" xmlns:pic="http://schemas.openxmlformats.org/drawingml/2006/picture">
                   <wp:extent cx="295656" cy="143256"/>
-                  <wp:docPr id="56" name="Picture 56"/>
+                  <wp:docPr id="65" name="Picture 65"/>
                   <wp:cNvGraphicFramePr>
                     <a:graphicFrameLocks noChangeAspect="1"/>
                   </wp:cNvGraphicFramePr>
@@ -4845,7 +5324,7 @@
                           <pic:cNvPicPr/>
                         </pic:nvPicPr>
                         <pic:blipFill>
-                          <a:blip r:embed="rId64"/>
+                          <a:blip r:embed="rId72"/>
                           <a:stretch>
                             <a:fillRect/>
                           </a:stretch>
@@ -4885,7 +5364,7 @@
               <w:drawing>
                 <wp:inline xmlns:a="http://schemas.openxmlformats.org/drawingml/2006/main" xmlns:pic="http://schemas.openxmlformats.org/drawingml/2006/picture">
                   <wp:extent cx="115824" cy="231648"/>
-                  <wp:docPr id="57" name="Picture 57"/>
+                  <wp:docPr id="66" name="Picture 66"/>
                   <wp:cNvGraphicFramePr>
                     <a:graphicFrameLocks noChangeAspect="1"/>
                   </wp:cNvGraphicFramePr>
@@ -4897,7 +5376,7 @@
                           <pic:cNvPicPr/>
                         </pic:nvPicPr>
                         <pic:blipFill>
-                          <a:blip r:embed="rId65"/>
+                          <a:blip r:embed="rId73"/>
                           <a:stretch>
                             <a:fillRect/>
                           </a:stretch>
@@ -4971,7 +5450,7 @@
               <w:drawing>
                 <wp:inline xmlns:a="http://schemas.openxmlformats.org/drawingml/2006/main" xmlns:pic="http://schemas.openxmlformats.org/drawingml/2006/picture">
                   <wp:extent cx="597408" cy="170688"/>
-                  <wp:docPr id="58" name="Picture 58"/>
+                  <wp:docPr id="67" name="Picture 67"/>
                   <wp:cNvGraphicFramePr>
                     <a:graphicFrameLocks noChangeAspect="1"/>
                   </wp:cNvGraphicFramePr>
@@ -4983,7 +5462,7 @@
                           <pic:cNvPicPr/>
                         </pic:nvPicPr>
                         <pic:blipFill>
-                          <a:blip r:embed="rId66"/>
+                          <a:blip r:embed="rId74"/>
                           <a:stretch>
                             <a:fillRect/>
                           </a:stretch>
@@ -5023,7 +5502,7 @@
               <w:drawing>
                 <wp:inline xmlns:a="http://schemas.openxmlformats.org/drawingml/2006/main" xmlns:pic="http://schemas.openxmlformats.org/drawingml/2006/picture">
                   <wp:extent cx="173736" cy="249935"/>
-                  <wp:docPr id="59" name="Picture 59"/>
+                  <wp:docPr id="68" name="Picture 68"/>
                   <wp:cNvGraphicFramePr>
                     <a:graphicFrameLocks noChangeAspect="1"/>
                   </wp:cNvGraphicFramePr>
@@ -5035,7 +5514,7 @@
                           <pic:cNvPicPr/>
                         </pic:nvPicPr>
                         <pic:blipFill>
-                          <a:blip r:embed="rId67"/>
+                          <a:blip r:embed="rId75"/>
                           <a:stretch>
                             <a:fillRect/>
                           </a:stretch>
@@ -5199,7 +5678,7 @@
                 <w:color w:val="1A1A1A"/>
                 <w:sz w:val="22"/>
               </w:rPr>
-              <w:t xml:space="preserve">12.   </w:t>
+              <w:t xml:space="preserve">13.   </w:t>
             </w:r>
             <w:r>
               <w:rPr>
@@ -5214,7 +5693,7 @@
               <w:drawing>
                 <wp:inline xmlns:a="http://schemas.openxmlformats.org/drawingml/2006/main" xmlns:pic="http://schemas.openxmlformats.org/drawingml/2006/picture">
                   <wp:extent cx="390144" cy="170688"/>
-                  <wp:docPr id="60" name="Picture 60"/>
+                  <wp:docPr id="69" name="Picture 69"/>
                   <wp:cNvGraphicFramePr>
                     <a:graphicFrameLocks noChangeAspect="1"/>
                   </wp:cNvGraphicFramePr>
@@ -5226,7 +5705,7 @@
                           <pic:cNvPicPr/>
                         </pic:nvPicPr>
                         <pic:blipFill>
-                          <a:blip r:embed="rId68"/>
+                          <a:blip r:embed="rId76"/>
                           <a:stretch>
                             <a:fillRect/>
                           </a:stretch>
@@ -5294,7 +5773,7 @@
               <w:drawing>
                 <wp:inline xmlns:a="http://schemas.openxmlformats.org/drawingml/2006/main" xmlns:pic="http://schemas.openxmlformats.org/drawingml/2006/picture">
                   <wp:extent cx="283464" cy="146304"/>
-                  <wp:docPr id="61" name="Picture 61"/>
+                  <wp:docPr id="70" name="Picture 70"/>
                   <wp:cNvGraphicFramePr>
                     <a:graphicFrameLocks noChangeAspect="1"/>
                   </wp:cNvGraphicFramePr>
@@ -5306,7 +5785,7 @@
                           <pic:cNvPicPr/>
                         </pic:nvPicPr>
                         <pic:blipFill>
-                          <a:blip r:embed="rId69"/>
+                          <a:blip r:embed="rId77"/>
                           <a:stretch>
                             <a:fillRect/>
                           </a:stretch>
@@ -5353,7 +5832,7 @@
               <w:drawing>
                 <wp:inline xmlns:a="http://schemas.openxmlformats.org/drawingml/2006/main" xmlns:pic="http://schemas.openxmlformats.org/drawingml/2006/picture">
                   <wp:extent cx="210312" cy="146304"/>
-                  <wp:docPr id="62" name="Picture 62"/>
+                  <wp:docPr id="71" name="Picture 71"/>
                   <wp:cNvGraphicFramePr>
                     <a:graphicFrameLocks noChangeAspect="1"/>
                   </wp:cNvGraphicFramePr>
@@ -5365,7 +5844,7 @@
                           <pic:cNvPicPr/>
                         </pic:nvPicPr>
                         <pic:blipFill>
-                          <a:blip r:embed="rId70"/>
+                          <a:blip r:embed="rId78"/>
                           <a:stretch>
                             <a:fillRect/>
                           </a:stretch>
@@ -5412,7 +5891,7 @@
               <w:drawing>
                 <wp:inline xmlns:a="http://schemas.openxmlformats.org/drawingml/2006/main" xmlns:pic="http://schemas.openxmlformats.org/drawingml/2006/picture">
                   <wp:extent cx="280416" cy="143256"/>
-                  <wp:docPr id="63" name="Picture 63"/>
+                  <wp:docPr id="72" name="Picture 72"/>
                   <wp:cNvGraphicFramePr>
                     <a:graphicFrameLocks noChangeAspect="1"/>
                   </wp:cNvGraphicFramePr>
@@ -5424,7 +5903,7 @@
                           <pic:cNvPicPr/>
                         </pic:nvPicPr>
                         <pic:blipFill>
-                          <a:blip r:embed="rId71"/>
+                          <a:blip r:embed="rId79"/>
                           <a:stretch>
                             <a:fillRect/>
                           </a:stretch>
@@ -5471,7 +5950,7 @@
               <w:drawing>
                 <wp:inline xmlns:a="http://schemas.openxmlformats.org/drawingml/2006/main" xmlns:pic="http://schemas.openxmlformats.org/drawingml/2006/picture">
                   <wp:extent cx="219456" cy="146304"/>
-                  <wp:docPr id="64" name="Picture 64"/>
+                  <wp:docPr id="73" name="Picture 73"/>
                   <wp:cNvGraphicFramePr>
                     <a:graphicFrameLocks noChangeAspect="1"/>
                   </wp:cNvGraphicFramePr>
@@ -5483,7 +5962,7 @@
                           <pic:cNvPicPr/>
                         </pic:nvPicPr>
                         <pic:blipFill>
-                          <a:blip r:embed="rId72"/>
+                          <a:blip r:embed="rId80"/>
                           <a:stretch>
                             <a:fillRect/>
                           </a:stretch>
@@ -5590,7 +6069,7 @@
                 <w:color w:val="1A1A1A"/>
                 <w:sz w:val="22"/>
               </w:rPr>
-              <w:t xml:space="preserve">13.   </w:t>
+              <w:t xml:space="preserve">14.   </w:t>
             </w:r>
             <w:r>
               <w:rPr>
@@ -5605,7 +6084,7 @@
               <w:drawing>
                 <wp:inline xmlns:a="http://schemas.openxmlformats.org/drawingml/2006/main" xmlns:pic="http://schemas.openxmlformats.org/drawingml/2006/picture">
                   <wp:extent cx="143256" cy="143256"/>
-                  <wp:docPr id="65" name="Picture 65"/>
+                  <wp:docPr id="74" name="Picture 74"/>
                   <wp:cNvGraphicFramePr>
                     <a:graphicFrameLocks noChangeAspect="1"/>
                   </wp:cNvGraphicFramePr>
@@ -5617,7 +6096,7 @@
                           <pic:cNvPicPr/>
                         </pic:nvPicPr>
                         <pic:blipFill>
-                          <a:blip r:embed="rId73"/>
+                          <a:blip r:embed="rId81"/>
                           <a:stretch>
                             <a:fillRect/>
                           </a:stretch>
@@ -5648,7 +6127,7 @@
               <w:drawing>
                 <wp:inline xmlns:a="http://schemas.openxmlformats.org/drawingml/2006/main" xmlns:pic="http://schemas.openxmlformats.org/drawingml/2006/picture">
                   <wp:extent cx="222504" cy="143256"/>
-                  <wp:docPr id="66" name="Picture 66"/>
+                  <wp:docPr id="75" name="Picture 75"/>
                   <wp:cNvGraphicFramePr>
                     <a:graphicFrameLocks noChangeAspect="1"/>
                   </wp:cNvGraphicFramePr>
@@ -5660,7 +6139,7 @@
                           <pic:cNvPicPr/>
                         </pic:nvPicPr>
                         <pic:blipFill>
-                          <a:blip r:embed="rId74"/>
+                          <a:blip r:embed="rId82"/>
                           <a:stretch>
                             <a:fillRect/>
                           </a:stretch>
@@ -5691,7 +6170,7 @@
               <w:drawing>
                 <wp:inline xmlns:a="http://schemas.openxmlformats.org/drawingml/2006/main" xmlns:pic="http://schemas.openxmlformats.org/drawingml/2006/picture">
                   <wp:extent cx="313944" cy="118872"/>
-                  <wp:docPr id="67" name="Picture 67"/>
+                  <wp:docPr id="76" name="Picture 76"/>
                   <wp:cNvGraphicFramePr>
                     <a:graphicFrameLocks noChangeAspect="1"/>
                   </wp:cNvGraphicFramePr>
@@ -5703,7 +6182,7 @@
                           <pic:cNvPicPr/>
                         </pic:nvPicPr>
                         <pic:blipFill>
-                          <a:blip r:embed="rId75"/>
+                          <a:blip r:embed="rId83"/>
                           <a:stretch>
                             <a:fillRect/>
                           </a:stretch>
@@ -5761,7 +6240,7 @@
               <w:drawing>
                 <wp:inline xmlns:a="http://schemas.openxmlformats.org/drawingml/2006/main" xmlns:pic="http://schemas.openxmlformats.org/drawingml/2006/picture">
                   <wp:extent cx="502920" cy="228600"/>
-                  <wp:docPr id="68" name="Picture 68"/>
+                  <wp:docPr id="77" name="Picture 77"/>
                   <wp:cNvGraphicFramePr>
                     <a:graphicFrameLocks noChangeAspect="1"/>
                   </wp:cNvGraphicFramePr>
@@ -5773,7 +6252,7 @@
                           <pic:cNvPicPr/>
                         </pic:nvPicPr>
                         <pic:blipFill>
-                          <a:blip r:embed="rId76"/>
+                          <a:blip r:embed="rId84"/>
                           <a:stretch>
                             <a:fillRect/>
                           </a:stretch>
@@ -5804,7 +6283,7 @@
               <w:drawing>
                 <wp:inline xmlns:a="http://schemas.openxmlformats.org/drawingml/2006/main" xmlns:pic="http://schemas.openxmlformats.org/drawingml/2006/picture">
                   <wp:extent cx="469392" cy="143256"/>
-                  <wp:docPr id="69" name="Picture 69"/>
+                  <wp:docPr id="78" name="Picture 78"/>
                   <wp:cNvGraphicFramePr>
                     <a:graphicFrameLocks noChangeAspect="1"/>
                   </wp:cNvGraphicFramePr>
@@ -5816,7 +6295,7 @@
                           <pic:cNvPicPr/>
                         </pic:nvPicPr>
                         <pic:blipFill>
-                          <a:blip r:embed="rId77"/>
+                          <a:blip r:embed="rId85"/>
                           <a:stretch>
                             <a:fillRect/>
                           </a:stretch>
@@ -5847,7 +6326,7 @@
               <w:drawing>
                 <wp:inline xmlns:a="http://schemas.openxmlformats.org/drawingml/2006/main" xmlns:pic="http://schemas.openxmlformats.org/drawingml/2006/picture">
                   <wp:extent cx="515112" cy="216408"/>
-                  <wp:docPr id="70" name="Picture 70"/>
+                  <wp:docPr id="79" name="Picture 79"/>
                   <wp:cNvGraphicFramePr>
                     <a:graphicFrameLocks noChangeAspect="1"/>
                   </wp:cNvGraphicFramePr>
@@ -5859,7 +6338,7 @@
                           <pic:cNvPicPr/>
                         </pic:nvPicPr>
                         <pic:blipFill>
-                          <a:blip r:embed="rId78"/>
+                          <a:blip r:embed="rId86"/>
                           <a:stretch>
                             <a:fillRect/>
                           </a:stretch>
@@ -5998,7 +6477,7 @@
           <w:color w:val="6B6B6B"/>
           <w:sz w:val="19"/>
         </w:rPr>
-        <w:t>11 points</w:t>
+        <w:t>12 points</w:t>
       </w:r>
     </w:p>
     <w:tbl>
@@ -6043,7 +6522,7 @@
                 <w:color w:val="1A1A1A"/>
                 <w:sz w:val="22"/>
               </w:rPr>
-              <w:t xml:space="preserve">14.   </w:t>
+              <w:t xml:space="preserve">15.   </w:t>
             </w:r>
             <w:r>
               <w:rPr>
@@ -6103,7 +6582,7 @@
               <w:drawing>
                 <wp:inline xmlns:a="http://schemas.openxmlformats.org/drawingml/2006/main" xmlns:pic="http://schemas.openxmlformats.org/drawingml/2006/picture">
                   <wp:extent cx="569976" cy="149352"/>
-                  <wp:docPr id="71" name="Picture 71"/>
+                  <wp:docPr id="80" name="Picture 80"/>
                   <wp:cNvGraphicFramePr>
                     <a:graphicFrameLocks noChangeAspect="1"/>
                   </wp:cNvGraphicFramePr>
@@ -6115,7 +6594,7 @@
                           <pic:cNvPicPr/>
                         </pic:nvPicPr>
                         <pic:blipFill>
-                          <a:blip r:embed="rId79"/>
+                          <a:blip r:embed="rId87"/>
                           <a:stretch>
                             <a:fillRect/>
                           </a:stretch>
@@ -6182,7 +6661,7 @@
               <w:drawing>
                 <wp:inline xmlns:a="http://schemas.openxmlformats.org/drawingml/2006/main" xmlns:pic="http://schemas.openxmlformats.org/drawingml/2006/picture">
                   <wp:extent cx="658368" cy="146304"/>
-                  <wp:docPr id="72" name="Picture 72"/>
+                  <wp:docPr id="81" name="Picture 81"/>
                   <wp:cNvGraphicFramePr>
                     <a:graphicFrameLocks noChangeAspect="1"/>
                   </wp:cNvGraphicFramePr>
@@ -6194,7 +6673,7 @@
                           <pic:cNvPicPr/>
                         </pic:nvPicPr>
                         <pic:blipFill>
-                          <a:blip r:embed="rId80"/>
+                          <a:blip r:embed="rId88"/>
                           <a:stretch>
                             <a:fillRect/>
                           </a:stretch>
@@ -6295,7 +6774,7 @@
               <w:drawing>
                 <wp:inline xmlns:a="http://schemas.openxmlformats.org/drawingml/2006/main" xmlns:pic="http://schemas.openxmlformats.org/drawingml/2006/picture">
                   <wp:extent cx="716280" cy="146304"/>
-                  <wp:docPr id="73" name="Picture 73"/>
+                  <wp:docPr id="82" name="Picture 82"/>
                   <wp:cNvGraphicFramePr>
                     <a:graphicFrameLocks noChangeAspect="1"/>
                   </wp:cNvGraphicFramePr>
@@ -6307,7 +6786,7 @@
                           <pic:cNvPicPr/>
                         </pic:nvPicPr>
                         <pic:blipFill>
-                          <a:blip r:embed="rId81"/>
+                          <a:blip r:embed="rId89"/>
                           <a:stretch>
                             <a:fillRect/>
                           </a:stretch>
@@ -6389,7 +6868,7 @@
               <w:drawing>
                 <wp:inline xmlns:a="http://schemas.openxmlformats.org/drawingml/2006/main" xmlns:pic="http://schemas.openxmlformats.org/drawingml/2006/picture">
                   <wp:extent cx="655320" cy="146304"/>
-                  <wp:docPr id="74" name="Picture 74"/>
+                  <wp:docPr id="83" name="Picture 83"/>
                   <wp:cNvGraphicFramePr>
                     <a:graphicFrameLocks noChangeAspect="1"/>
                   </wp:cNvGraphicFramePr>
@@ -6401,7 +6880,7 @@
                           <pic:cNvPicPr/>
                         </pic:nvPicPr>
                         <pic:blipFill>
-                          <a:blip r:embed="rId82"/>
+                          <a:blip r:embed="rId90"/>
                           <a:stretch>
                             <a:fillRect/>
                           </a:stretch>
@@ -6490,7 +6969,7 @@
                 <w:color w:val="1A1A1A"/>
                 <w:sz w:val="22"/>
               </w:rPr>
-              <w:t xml:space="preserve">15.   </w:t>
+              <w:t xml:space="preserve">16.   </w:t>
             </w:r>
             <w:r>
               <w:rPr>
@@ -6523,7 +7002,7 @@
               <w:drawing>
                 <wp:inline xmlns:a="http://schemas.openxmlformats.org/drawingml/2006/main" xmlns:pic="http://schemas.openxmlformats.org/drawingml/2006/picture">
                   <wp:extent cx="573024" cy="146304"/>
-                  <wp:docPr id="75" name="Picture 75"/>
+                  <wp:docPr id="84" name="Picture 84"/>
                   <wp:cNvGraphicFramePr>
                     <a:graphicFrameLocks noChangeAspect="1"/>
                   </wp:cNvGraphicFramePr>
@@ -6535,7 +7014,7 @@
                           <pic:cNvPicPr/>
                         </pic:nvPicPr>
                         <pic:blipFill>
-                          <a:blip r:embed="rId83"/>
+                          <a:blip r:embed="rId91"/>
                           <a:stretch>
                             <a:fillRect/>
                           </a:stretch>
@@ -6602,7 +7081,7 @@
               <w:drawing>
                 <wp:inline xmlns:a="http://schemas.openxmlformats.org/drawingml/2006/main" xmlns:pic="http://schemas.openxmlformats.org/drawingml/2006/picture">
                   <wp:extent cx="655320" cy="149352"/>
-                  <wp:docPr id="76" name="Picture 76"/>
+                  <wp:docPr id="85" name="Picture 85"/>
                   <wp:cNvGraphicFramePr>
                     <a:graphicFrameLocks noChangeAspect="1"/>
                   </wp:cNvGraphicFramePr>
@@ -6614,7 +7093,7 @@
                           <pic:cNvPicPr/>
                         </pic:nvPicPr>
                         <pic:blipFill>
-                          <a:blip r:embed="rId84"/>
+                          <a:blip r:embed="rId92"/>
                           <a:stretch>
                             <a:fillRect/>
                           </a:stretch>
@@ -6733,7 +7212,7 @@
                 <w:color w:val="1A1A1A"/>
                 <w:sz w:val="22"/>
               </w:rPr>
-              <w:t xml:space="preserve">16.   </w:t>
+              <w:t xml:space="preserve">17.   </w:t>
             </w:r>
             <w:r>
               <w:rPr>
@@ -6785,7 +7264,7 @@
               <w:drawing>
                 <wp:inline xmlns:a="http://schemas.openxmlformats.org/drawingml/2006/main" xmlns:pic="http://schemas.openxmlformats.org/drawingml/2006/picture">
                   <wp:extent cx="649224" cy="146304"/>
-                  <wp:docPr id="77" name="Picture 77"/>
+                  <wp:docPr id="86" name="Picture 86"/>
                   <wp:cNvGraphicFramePr>
                     <a:graphicFrameLocks noChangeAspect="1"/>
                   </wp:cNvGraphicFramePr>
@@ -6797,7 +7276,7 @@
                           <pic:cNvPicPr/>
                         </pic:nvPicPr>
                         <pic:blipFill>
-                          <a:blip r:embed="rId85"/>
+                          <a:blip r:embed="rId93"/>
                           <a:stretch>
                             <a:fillRect/>
                           </a:stretch>
@@ -6844,7 +7323,7 @@
               <w:drawing>
                 <wp:inline xmlns:a="http://schemas.openxmlformats.org/drawingml/2006/main" xmlns:pic="http://schemas.openxmlformats.org/drawingml/2006/picture">
                   <wp:extent cx="652272" cy="146304"/>
-                  <wp:docPr id="78" name="Picture 78"/>
+                  <wp:docPr id="87" name="Picture 87"/>
                   <wp:cNvGraphicFramePr>
                     <a:graphicFrameLocks noChangeAspect="1"/>
                   </wp:cNvGraphicFramePr>
@@ -6856,7 +7335,7 @@
                           <pic:cNvPicPr/>
                         </pic:nvPicPr>
                         <pic:blipFill>
-                          <a:blip r:embed="rId86"/>
+                          <a:blip r:embed="rId94"/>
                           <a:stretch>
                             <a:fillRect/>
                           </a:stretch>
@@ -6903,7 +7382,7 @@
               <w:drawing>
                 <wp:inline xmlns:a="http://schemas.openxmlformats.org/drawingml/2006/main" xmlns:pic="http://schemas.openxmlformats.org/drawingml/2006/picture">
                   <wp:extent cx="612648" cy="146304"/>
-                  <wp:docPr id="79" name="Picture 79"/>
+                  <wp:docPr id="88" name="Picture 88"/>
                   <wp:cNvGraphicFramePr>
                     <a:graphicFrameLocks noChangeAspect="1"/>
                   </wp:cNvGraphicFramePr>
@@ -6915,7 +7394,7 @@
                           <pic:cNvPicPr/>
                         </pic:nvPicPr>
                         <pic:blipFill>
-                          <a:blip r:embed="rId87"/>
+                          <a:blip r:embed="rId95"/>
                           <a:stretch>
                             <a:fillRect/>
                           </a:stretch>
@@ -6962,7 +7441,7 @@
               <w:drawing>
                 <wp:inline xmlns:a="http://schemas.openxmlformats.org/drawingml/2006/main" xmlns:pic="http://schemas.openxmlformats.org/drawingml/2006/picture">
                   <wp:extent cx="569976" cy="146304"/>
-                  <wp:docPr id="80" name="Picture 80"/>
+                  <wp:docPr id="89" name="Picture 89"/>
                   <wp:cNvGraphicFramePr>
                     <a:graphicFrameLocks noChangeAspect="1"/>
                   </wp:cNvGraphicFramePr>
@@ -6974,7 +7453,7 @@
                           <pic:cNvPicPr/>
                         </pic:nvPicPr>
                         <pic:blipFill>
-                          <a:blip r:embed="rId88"/>
+                          <a:blip r:embed="rId96"/>
                           <a:stretch>
                             <a:fillRect/>
                           </a:stretch>
@@ -7078,7 +7557,7 @@
                 <w:color w:val="1A1A1A"/>
                 <w:sz w:val="22"/>
               </w:rPr>
-              <w:t xml:space="preserve">17.   </w:t>
+              <w:t xml:space="preserve">18.   </w:t>
             </w:r>
             <w:r>
               <w:rPr>
@@ -7120,7 +7599,7 @@
               <w:drawing>
                 <wp:inline xmlns:a="http://schemas.openxmlformats.org/drawingml/2006/main" xmlns:pic="http://schemas.openxmlformats.org/drawingml/2006/picture">
                   <wp:extent cx="454152" cy="146304"/>
-                  <wp:docPr id="81" name="Picture 81"/>
+                  <wp:docPr id="90" name="Picture 90"/>
                   <wp:cNvGraphicFramePr>
                     <a:graphicFrameLocks noChangeAspect="1"/>
                   </wp:cNvGraphicFramePr>
@@ -7132,7 +7611,7 @@
                           <pic:cNvPicPr/>
                         </pic:nvPicPr>
                         <pic:blipFill>
-                          <a:blip r:embed="rId89"/>
+                          <a:blip r:embed="rId97"/>
                           <a:stretch>
                             <a:fillRect/>
                           </a:stretch>
@@ -7163,7 +7642,7 @@
               <w:drawing>
                 <wp:inline xmlns:a="http://schemas.openxmlformats.org/drawingml/2006/main" xmlns:pic="http://schemas.openxmlformats.org/drawingml/2006/picture">
                   <wp:extent cx="451104" cy="149352"/>
-                  <wp:docPr id="82" name="Picture 82"/>
+                  <wp:docPr id="91" name="Picture 91"/>
                   <wp:cNvGraphicFramePr>
                     <a:graphicFrameLocks noChangeAspect="1"/>
                   </wp:cNvGraphicFramePr>
@@ -7175,7 +7654,7 @@
                           <pic:cNvPicPr/>
                         </pic:nvPicPr>
                         <pic:blipFill>
-                          <a:blip r:embed="rId90"/>
+                          <a:blip r:embed="rId98"/>
                           <a:stretch>
                             <a:fillRect/>
                           </a:stretch>
@@ -7224,7 +7703,7 @@
               <w:drawing>
                 <wp:inline xmlns:a="http://schemas.openxmlformats.org/drawingml/2006/main" xmlns:pic="http://schemas.openxmlformats.org/drawingml/2006/picture">
                   <wp:extent cx="990599" cy="164592"/>
-                  <wp:docPr id="83" name="Picture 83"/>
+                  <wp:docPr id="92" name="Picture 92"/>
                   <wp:cNvGraphicFramePr>
                     <a:graphicFrameLocks noChangeAspect="1"/>
                   </wp:cNvGraphicFramePr>
@@ -7236,7 +7715,7 @@
                           <pic:cNvPicPr/>
                         </pic:nvPicPr>
                         <pic:blipFill>
-                          <a:blip r:embed="rId91"/>
+                          <a:blip r:embed="rId99"/>
                           <a:stretch>
                             <a:fillRect/>
                           </a:stretch>
@@ -7385,7 +7864,7 @@
               <w:drawing>
                 <wp:inline xmlns:a="http://schemas.openxmlformats.org/drawingml/2006/main" xmlns:pic="http://schemas.openxmlformats.org/drawingml/2006/picture">
                   <wp:extent cx="655320" cy="146304"/>
-                  <wp:docPr id="84" name="Picture 84"/>
+                  <wp:docPr id="93" name="Picture 93"/>
                   <wp:cNvGraphicFramePr>
                     <a:graphicFrameLocks noChangeAspect="1"/>
                   </wp:cNvGraphicFramePr>
@@ -7397,7 +7876,7 @@
                           <pic:cNvPicPr/>
                         </pic:nvPicPr>
                         <pic:blipFill>
-                          <a:blip r:embed="rId92"/>
+                          <a:blip r:embed="rId100"/>
                           <a:stretch>
                             <a:fillRect/>
                           </a:stretch>
@@ -7428,7 +7907,7 @@
               <w:drawing>
                 <wp:inline xmlns:a="http://schemas.openxmlformats.org/drawingml/2006/main" xmlns:pic="http://schemas.openxmlformats.org/drawingml/2006/picture">
                   <wp:extent cx="637032" cy="143256"/>
-                  <wp:docPr id="85" name="Picture 85"/>
+                  <wp:docPr id="94" name="Picture 94"/>
                   <wp:cNvGraphicFramePr>
                     <a:graphicFrameLocks noChangeAspect="1"/>
                   </wp:cNvGraphicFramePr>
@@ -7440,7 +7919,7 @@
                           <pic:cNvPicPr/>
                         </pic:nvPicPr>
                         <pic:blipFill>
-                          <a:blip r:embed="rId93"/>
+                          <a:blip r:embed="rId101"/>
                           <a:stretch>
                             <a:fillRect/>
                           </a:stretch>
@@ -7489,7 +7968,7 @@
               <w:drawing>
                 <wp:inline xmlns:a="http://schemas.openxmlformats.org/drawingml/2006/main" xmlns:pic="http://schemas.openxmlformats.org/drawingml/2006/picture">
                   <wp:extent cx="1072896" cy="164592"/>
-                  <wp:docPr id="86" name="Picture 86"/>
+                  <wp:docPr id="95" name="Picture 95"/>
                   <wp:cNvGraphicFramePr>
                     <a:graphicFrameLocks noChangeAspect="1"/>
                   </wp:cNvGraphicFramePr>
@@ -7501,7 +7980,7 @@
                           <pic:cNvPicPr/>
                         </pic:nvPicPr>
                         <pic:blipFill>
-                          <a:blip r:embed="rId94"/>
+                          <a:blip r:embed="rId102"/>
                           <a:stretch>
                             <a:fillRect/>
                           </a:stretch>
@@ -7617,7 +8096,7 @@
                 <w:color w:val="1A1A1A"/>
                 <w:sz w:val="22"/>
               </w:rPr>
-              <w:t xml:space="preserve">18.   </w:t>
+              <w:t xml:space="preserve">19.   </w:t>
             </w:r>
             <w:r>
               <w:rPr>
@@ -7632,7 +8111,7 @@
               <w:drawing>
                 <wp:inline xmlns:a="http://schemas.openxmlformats.org/drawingml/2006/main" xmlns:pic="http://schemas.openxmlformats.org/drawingml/2006/picture">
                   <wp:extent cx="649224" cy="146304"/>
-                  <wp:docPr id="87" name="Picture 87"/>
+                  <wp:docPr id="96" name="Picture 96"/>
                   <wp:cNvGraphicFramePr>
                     <a:graphicFrameLocks noChangeAspect="1"/>
                   </wp:cNvGraphicFramePr>
@@ -7644,7 +8123,7 @@
                           <pic:cNvPicPr/>
                         </pic:nvPicPr>
                         <pic:blipFill>
-                          <a:blip r:embed="rId95"/>
+                          <a:blip r:embed="rId103"/>
                           <a:stretch>
                             <a:fillRect/>
                           </a:stretch>
@@ -7675,7 +8154,7 @@
               <w:drawing>
                 <wp:inline xmlns:a="http://schemas.openxmlformats.org/drawingml/2006/main" xmlns:pic="http://schemas.openxmlformats.org/drawingml/2006/picture">
                   <wp:extent cx="652272" cy="146304"/>
-                  <wp:docPr id="88" name="Picture 88"/>
+                  <wp:docPr id="97" name="Picture 97"/>
                   <wp:cNvGraphicFramePr>
                     <a:graphicFrameLocks noChangeAspect="1"/>
                   </wp:cNvGraphicFramePr>
@@ -7687,7 +8166,7 @@
                           <pic:cNvPicPr/>
                         </pic:nvPicPr>
                         <pic:blipFill>
-                          <a:blip r:embed="rId96"/>
+                          <a:blip r:embed="rId104"/>
                           <a:stretch>
                             <a:fillRect/>
                           </a:stretch>
@@ -7736,7 +8215,7 @@
               <w:drawing>
                 <wp:inline xmlns:a="http://schemas.openxmlformats.org/drawingml/2006/main" xmlns:pic="http://schemas.openxmlformats.org/drawingml/2006/picture">
                   <wp:extent cx="652272" cy="146304"/>
-                  <wp:docPr id="89" name="Picture 89"/>
+                  <wp:docPr id="98" name="Picture 98"/>
                   <wp:cNvGraphicFramePr>
                     <a:graphicFrameLocks noChangeAspect="1"/>
                   </wp:cNvGraphicFramePr>
@@ -7748,7 +8227,7 @@
                           <pic:cNvPicPr/>
                         </pic:nvPicPr>
                         <pic:blipFill>
-                          <a:blip r:embed="rId97"/>
+                          <a:blip r:embed="rId105"/>
                           <a:stretch>
                             <a:fillRect/>
                           </a:stretch>
@@ -7883,7 +8362,7 @@
                 <w:color w:val="1A1A1A"/>
                 <w:sz w:val="22"/>
               </w:rPr>
-              <w:t xml:space="preserve">19.   </w:t>
+              <w:t xml:space="preserve">20.   </w:t>
             </w:r>
             <w:r>
               <w:rPr>
@@ -7954,6 +8433,309 @@
                 <w:sz w:val="19"/>
               </w:rPr>
               <w:t>.</w:t>
+            </w:r>
+          </w:p>
+          <w:p>
+            <w:pPr>
+              <w:spacing w:before="40" w:after="120"/>
+              <w:ind w:left="420"/>
+            </w:pPr>
+            <w:r>
+              <w:rPr>
+                <w:b w:val="0"/>
+                <w:i/>
+                <w:color w:val="6B6B6B"/>
+                <w:sz w:val="19"/>
+              </w:rPr>
+              <w:t>Scoring: 1 point.</w:t>
+            </w:r>
+          </w:p>
+        </w:tc>
+      </w:tr>
+    </w:tbl>
+    <w:p>
+      <w:pPr>
+        <w:spacing w:after="0" w:before="0" w:line="20" w:lineRule="exact"/>
+      </w:pPr>
+      <w:r>
+        <w:rPr>
+          <w:sz w:val="2"/>
+        </w:rPr>
+      </w:r>
+    </w:p>
+    <w:tbl>
+      <w:tblPr>
+        <w:tblLayout w:type="fixed"/>
+        <w:tblLook w:firstColumn="1" w:firstRow="1" w:lastColumn="0" w:lastRow="0" w:noHBand="0" w:noVBand="1" w:val="04A0"/>
+        <w:tblLayout w:type="fixed"/>
+        <w:tblW w:w="9360" w:type="dxa"/>
+      </w:tblPr>
+      <w:tblGrid>
+        <w:gridCol w:w="9360"/>
+      </w:tblGrid>
+      <w:tr>
+        <w:trPr>
+          <w:cantSplit/>
+        </w:trPr>
+        <w:tc>
+          <w:tcPr>
+            <w:tcW w:type="dxa" w:w="9360"/>
+            <w:tcBorders>
+              <w:top w:val="nil"/>
+              <w:left w:val="nil"/>
+              <w:bottom w:val="nil"/>
+              <w:right w:val="nil"/>
+            </w:tcBorders>
+            <w:tcMar>
+              <w:top w:w="0" w:type="dxa"/>
+              <w:left w:w="0" w:type="dxa"/>
+              <w:bottom w:w="0" w:type="dxa"/>
+              <w:right w:w="0" w:type="dxa"/>
+            </w:tcMar>
+          </w:tcPr>
+          <w:p>
+            <w:pPr>
+              <w:spacing w:before="200" w:after="120"/>
+              <w:ind w:left="420" w:hanging="420"/>
+              <w:tabs>
+                <w:tab w:val="right" w:pos="9360"/>
+              </w:tabs>
+            </w:pPr>
+            <w:r>
+              <w:rPr>
+                <w:b/>
+                <w:i w:val="0"/>
+                <w:color w:val="1A1A1A"/>
+                <w:sz w:val="22"/>
+              </w:rPr>
+              <w:t xml:space="preserve">21.   </w:t>
+            </w:r>
+            <w:r>
+              <w:rPr>
+                <w:b w:val="0"/>
+                <w:i w:val="0"/>
+                <w:color w:val="1A1A1A"/>
+                <w:sz w:val="22"/>
+              </w:rPr>
+              <w:t xml:space="preserve">Between which two consecutive powers of 10 does  </w:t>
+            </w:r>
+            <w:r>
+              <w:drawing>
+                <wp:inline xmlns:a="http://schemas.openxmlformats.org/drawingml/2006/main" xmlns:pic="http://schemas.openxmlformats.org/drawingml/2006/picture">
+                  <wp:extent cx="655320" cy="146304"/>
+                  <wp:docPr id="99" name="Picture 99"/>
+                  <wp:cNvGraphicFramePr>
+                    <a:graphicFrameLocks noChangeAspect="1"/>
+                  </wp:cNvGraphicFramePr>
+                  <a:graphic>
+                    <a:graphicData uri="http://schemas.openxmlformats.org/drawingml/2006/picture">
+                      <pic:pic>
+                        <pic:nvPicPr>
+                          <pic:cNvPr id="0" name="0f2de37ba51fb35e.png"/>
+                          <pic:cNvPicPr/>
+                        </pic:nvPicPr>
+                        <pic:blipFill>
+                          <a:blip r:embed="rId106"/>
+                          <a:stretch>
+                            <a:fillRect/>
+                          </a:stretch>
+                        </pic:blipFill>
+                        <pic:spPr>
+                          <a:xfrm>
+                            <a:off x="0" y="0"/>
+                            <a:ext cx="655320" cy="146304"/>
+                          </a:xfrm>
+                          <a:prstGeom prst="rect"/>
+                        </pic:spPr>
+                      </pic:pic>
+                    </a:graphicData>
+                  </a:graphic>
+                </wp:inline>
+              </w:drawing>
+            </w:r>
+            <w:r>
+              <w:rPr>
+                <w:b w:val="0"/>
+                <w:i w:val="0"/>
+                <w:color w:val="1A1A1A"/>
+                <w:sz w:val="22"/>
+              </w:rPr>
+              <w:t xml:space="preserve">  lie?</w:t>
+            </w:r>
+            <w:r>
+              <w:tab/>
+            </w:r>
+            <w:r>
+              <w:rPr>
+                <w:b w:val="0"/>
+                <w:i/>
+                <w:color w:val="6B6B6B"/>
+                <w:sz w:val="19"/>
+              </w:rPr>
+              <w:t>1 pt</w:t>
+            </w:r>
+          </w:p>
+          <w:p>
+            <w:pPr>
+              <w:spacing w:before="40" w:after="60"/>
+              <w:ind w:left="420"/>
+            </w:pPr>
+            <w:r>
+              <w:rPr>
+                <w:b/>
+                <w:i/>
+                <w:color w:val="9E1B32"/>
+                <w:sz w:val="22"/>
+              </w:rPr>
+              <w:t xml:space="preserve">Between </w:t>
+            </w:r>
+            <w:r>
+              <w:drawing>
+                <wp:inline xmlns:a="http://schemas.openxmlformats.org/drawingml/2006/main" xmlns:pic="http://schemas.openxmlformats.org/drawingml/2006/picture">
+                  <wp:extent cx="277368" cy="143256"/>
+                  <wp:docPr id="100" name="Picture 100"/>
+                  <wp:cNvGraphicFramePr>
+                    <a:graphicFrameLocks noChangeAspect="1"/>
+                  </wp:cNvGraphicFramePr>
+                  <a:graphic>
+                    <a:graphicData uri="http://schemas.openxmlformats.org/drawingml/2006/picture">
+                      <pic:pic>
+                        <pic:nvPicPr>
+                          <pic:cNvPr id="0" name="e1eb27eff9ab3c20.png"/>
+                          <pic:cNvPicPr/>
+                        </pic:nvPicPr>
+                        <pic:blipFill>
+                          <a:blip r:embed="rId107"/>
+                          <a:stretch>
+                            <a:fillRect/>
+                          </a:stretch>
+                        </pic:blipFill>
+                        <pic:spPr>
+                          <a:xfrm>
+                            <a:off x="0" y="0"/>
+                            <a:ext cx="277368" cy="143256"/>
+                          </a:xfrm>
+                          <a:prstGeom prst="rect"/>
+                        </pic:spPr>
+                      </pic:pic>
+                    </a:graphicData>
+                  </a:graphic>
+                </wp:inline>
+              </w:drawing>
+            </w:r>
+            <w:r>
+              <w:rPr>
+                <w:b/>
+                <w:i/>
+                <w:color w:val="9E1B32"/>
+                <w:sz w:val="22"/>
+              </w:rPr>
+              <w:t xml:space="preserve"> and </w:t>
+            </w:r>
+            <w:r>
+              <w:drawing>
+                <wp:inline xmlns:a="http://schemas.openxmlformats.org/drawingml/2006/main" xmlns:pic="http://schemas.openxmlformats.org/drawingml/2006/picture">
+                  <wp:extent cx="280416" cy="143256"/>
+                  <wp:docPr id="101" name="Picture 101"/>
+                  <wp:cNvGraphicFramePr>
+                    <a:graphicFrameLocks noChangeAspect="1"/>
+                  </wp:cNvGraphicFramePr>
+                  <a:graphic>
+                    <a:graphicData uri="http://schemas.openxmlformats.org/drawingml/2006/picture">
+                      <pic:pic>
+                        <pic:nvPicPr>
+                          <pic:cNvPr id="0" name="80122f8883244372.png"/>
+                          <pic:cNvPicPr/>
+                        </pic:nvPicPr>
+                        <pic:blipFill>
+                          <a:blip r:embed="rId108"/>
+                          <a:stretch>
+                            <a:fillRect/>
+                          </a:stretch>
+                        </pic:blipFill>
+                        <pic:spPr>
+                          <a:xfrm>
+                            <a:off x="0" y="0"/>
+                            <a:ext cx="280416" cy="143256"/>
+                          </a:xfrm>
+                          <a:prstGeom prst="rect"/>
+                        </pic:spPr>
+                      </pic:pic>
+                    </a:graphicData>
+                  </a:graphic>
+                </wp:inline>
+              </w:drawing>
+            </w:r>
+            <w:r>
+              <w:rPr>
+                <w:b/>
+                <w:i/>
+                <w:color w:val="9E1B32"/>
+                <w:sz w:val="22"/>
+              </w:rPr>
+              <w:t>.</w:t>
+            </w:r>
+          </w:p>
+          <w:p>
+            <w:pPr>
+              <w:spacing w:before="0" w:after="120"/>
+              <w:ind w:left="420"/>
+            </w:pPr>
+            <w:r>
+              <w:rPr>
+                <w:b w:val="0"/>
+                <w:i/>
+                <w:color w:val="6B6B6B"/>
+                <w:sz w:val="19"/>
+              </w:rPr>
+              <w:t>4.7 is between 1 and 10, so the number is between 1×10</w:t>
+            </w:r>
+            <w:r>
+              <w:rPr>
+                <w:b w:val="0"/>
+                <w:i/>
+                <w:color w:val="6B6B6B"/>
+                <w:sz w:val="19"/>
+                <w:vertAlign w:val="superscript"/>
+              </w:rPr>
+              <w:t>-5</w:t>
+            </w:r>
+            <w:r>
+              <w:rPr>
+                <w:b w:val="0"/>
+                <w:i/>
+                <w:color w:val="6B6B6B"/>
+                <w:sz w:val="19"/>
+              </w:rPr>
+              <w:t xml:space="preserve"> and 1×10</w:t>
+            </w:r>
+            <w:r>
+              <w:rPr>
+                <w:b w:val="0"/>
+                <w:i/>
+                <w:color w:val="6B6B6B"/>
+                <w:sz w:val="19"/>
+                <w:vertAlign w:val="superscript"/>
+              </w:rPr>
+              <w:t>-4</w:t>
+            </w:r>
+            <w:r>
+              <w:rPr>
+                <w:b w:val="0"/>
+                <w:i/>
+                <w:color w:val="6B6B6B"/>
+                <w:sz w:val="19"/>
+              </w:rPr>
+              <w:t xml:space="preserve">. Both powers are needed for the point.  </w:t>
+            </w:r>
+            <w:r>
+              <w:rPr>
+                <w:b/>
+                <w:i/>
+                <w:color w:val="6B6B6B"/>
+                <w:sz w:val="19"/>
+              </w:rPr>
+              <w:t>TRANSFER ITEM — not on the practice test. Same benchmark, a surface nobody rehearsed.</w:t>
             </w:r>
           </w:p>
           <w:p>
@@ -8013,7 +8795,7 @@
           <w:color w:val="1A1A1A"/>
           <w:sz w:val="20"/>
         </w:rPr>
-        <w:t>39 points, one point per lettered part.  Section 1 — 9  ·  Section 2 — 10  ·  Section 3 — 9  ·  Section 4 — 11</w:t>
+        <w:t>41 points, one point per lettered part.  Section 1 — 9  ·  Section 2 — 11  ·  Section 3 — 9  ·  Section 4 — 12</w:t>
       </w:r>
     </w:p>
     <w:tbl>
@@ -8349,7 +9131,7 @@
                 <w:color w:val="1A1A1A"/>
                 <w:sz w:val="21"/>
               </w:rPr>
-              <w:t>5,  6,  7,  8,  9</w:t>
+              <w:t>5,  6,  7,  8,  9,  10</w:t>
             </w:r>
           </w:p>
         </w:tc>
@@ -8380,7 +9162,7 @@
                 <w:color w:val="1A1A1A"/>
                 <w:sz w:val="21"/>
               </w:rPr>
-              <w:t>10</w:t>
+              <w:t>11</w:t>
             </w:r>
           </w:p>
         </w:tc>
@@ -8469,7 +9251,7 @@
                 <w:color w:val="1A1A1A"/>
                 <w:sz w:val="21"/>
               </w:rPr>
-              <w:t>10,  11,  12,  13</w:t>
+              <w:t>11,  12,  13,  14</w:t>
             </w:r>
           </w:p>
         </w:tc>
@@ -8589,7 +9371,7 @@
                 <w:color w:val="1A1A1A"/>
                 <w:sz w:val="21"/>
               </w:rPr>
-              <w:t>14,  15,  16,  17,  18,  19</w:t>
+              <w:t>15,  16,  17,  18,  19,  20,  21</w:t>
             </w:r>
           </w:p>
         </w:tc>
@@ -8620,7 +9402,7 @@
                 <w:color w:val="1A1A1A"/>
                 <w:sz w:val="21"/>
               </w:rPr>
-              <w:t>11</w:t>
+              <w:t>12</w:t>
             </w:r>
           </w:p>
         </w:tc>
@@ -8731,7 +9513,7 @@
                 <w:color w:val="1A1A1A"/>
                 <w:sz w:val="21"/>
               </w:rPr>
-              <w:t>39</w:t>
+              <w:t>41</w:t>
             </w:r>
           </w:p>
         </w:tc>
@@ -8780,7 +9562,21 @@
           <w:color w:val="6B6B6B"/>
           <w:sz w:val="19"/>
         </w:rPr>
-        <w:t>Follow-through.  If a student writes a wrong power in one part and then evaluates their own power correctly in the next, the next part still earns its point. Mark each part against what they wrote, not against the key.</w:t>
+        <w:t>Follow-through (ruling 19).  A later part is correct when the right operation is applied to the student's own earlier value. Look at what they wrote for the earlier part, do this part's operation to it, and tick if that is what they wrote. It applies only where the work is on the page.</w:t>
+      </w:r>
+    </w:p>
+    <w:p>
+      <w:pPr>
+        <w:spacing w:before="40" w:after="80"/>
+      </w:pPr>
+      <w:r>
+        <w:rPr>
+          <w:b w:val="0"/>
+          <w:i/>
+          <w:color w:val="6B6B6B"/>
+          <w:sz w:val="19"/>
+        </w:rPr>
+        <w:t>Transfer items (ruling 18): questions 10 and 21. Neither surface appears on the review or in any question bank.</w:t>
       </w:r>
     </w:p>
     <w:sectPr>

</xml_diff>